<commit_message>
Update README and enrich analysis notebook
Expand README with detailed "Mappeinnlevering" instructions and change log (includes PostGIS click-mode notes and updated last-updated date). Substantially enrich analyse_beredskap.ipynb with extended explanations for vector and raster methods (buffers, overlay, difference, raster→vector polygonize, DEM/slope/hillshade, nearest-neighbour, aggregation) and add a .bak copy for reproducibility. Add generated report files (mapperapport.pdf/.docx, semesterrapport.pdf/.docx) and a new build script (build_mapperapport_v2.js); minor update to build_report.js. Also add temporary/lock files and a notebook backup to support editing sessions.
</commit_message>
<xml_diff>
--- a/semesterrapport.docx
+++ b/semesterrapport.docx
@@ -116,22 +116,22 @@
     <w:p>
       <w:pPr>
         <w:pStyle w:val="Heading1"/>
-        <w:spacing w:after="180" w:before="360"/>
+        <w:spacing w:after="120" w:before="240"/>
       </w:pPr>
       <w:r>
         <w:rPr>
           <w:b/>
           <w:bCs/>
           <w:color w:val="1F2937"/>
-          <w:sz w:val="32"/>
-          <w:szCs w:val="32"/>
+          <w:sz w:val="30"/>
+          <w:szCs w:val="30"/>
         </w:rPr>
         <w:t xml:space="preserve">Samandrag</w:t>
       </w:r>
     </w:p>
     <w:p>
       <w:pPr>
-        <w:spacing w:after="120" w:before="60" w:line="300"/>
+        <w:spacing w:after="80" w:before="40" w:line="280"/>
         <w:jc w:val="both"/>
       </w:pPr>
       <w:r>
@@ -140,7 +140,7 @@
     </w:p>
     <w:p>
       <w:pPr>
-        <w:spacing w:after="120" w:before="60" w:line="300"/>
+        <w:spacing w:after="80" w:before="40" w:line="280"/>
         <w:jc w:val="both"/>
       </w:pPr>
       <w:r>
@@ -150,15 +150,15 @@
     <w:p>
       <w:pPr>
         <w:pStyle w:val="Heading1"/>
-        <w:spacing w:after="180" w:before="360"/>
+        <w:spacing w:after="120" w:before="240"/>
       </w:pPr>
       <w:r>
         <w:rPr>
           <w:b/>
           <w:bCs/>
           <w:color w:val="1F2937"/>
-          <w:sz w:val="32"/>
-          <w:szCs w:val="32"/>
+          <w:sz w:val="30"/>
+          <w:szCs w:val="30"/>
         </w:rPr>
         <w:t xml:space="preserve">1  Introduksjon</w:t>
       </w:r>
@@ -166,22 +166,22 @@
     <w:p>
       <w:pPr>
         <w:pStyle w:val="Heading2"/>
-        <w:spacing w:after="120" w:before="240"/>
+        <w:spacing w:after="80" w:before="180"/>
       </w:pPr>
       <w:r>
         <w:rPr>
           <w:b/>
           <w:bCs/>
           <w:color w:val="1F2937"/>
-          <w:sz w:val="26"/>
-          <w:szCs w:val="26"/>
+          <w:sz w:val="24"/>
+          <w:szCs w:val="24"/>
         </w:rPr>
         <w:t xml:space="preserve">1.1  Bakgrunn</w:t>
       </w:r>
     </w:p>
     <w:p>
       <w:pPr>
-        <w:spacing w:after="120" w:before="60" w:line="300"/>
+        <w:spacing w:after="80" w:before="40" w:line="280"/>
         <w:jc w:val="both"/>
       </w:pPr>
       <w:r>
@@ -190,7 +190,7 @@
     </w:p>
     <w:p>
       <w:pPr>
-        <w:spacing w:after="120" w:before="60" w:line="300"/>
+        <w:spacing w:after="80" w:before="40" w:line="280"/>
         <w:jc w:val="both"/>
       </w:pPr>
       <w:r>
@@ -200,22 +200,22 @@
     <w:p>
       <w:pPr>
         <w:pStyle w:val="Heading2"/>
-        <w:spacing w:after="120" w:before="240"/>
+        <w:spacing w:after="80" w:before="180"/>
       </w:pPr>
       <w:r>
         <w:rPr>
           <w:b/>
           <w:bCs/>
           <w:color w:val="1F2937"/>
-          <w:sz w:val="26"/>
-          <w:szCs w:val="26"/>
+          <w:sz w:val="24"/>
+          <w:szCs w:val="24"/>
         </w:rPr>
         <w:t xml:space="preserve">1.2  Problemstilling</w:t>
       </w:r>
     </w:p>
     <w:p>
       <w:pPr>
-        <w:spacing w:after="120" w:before="60" w:line="300"/>
+        <w:spacing w:after="80" w:before="40" w:line="280"/>
         <w:jc w:val="both"/>
       </w:pPr>
       <w:r>
@@ -235,7 +235,7 @@
     </w:p>
     <w:p>
       <w:pPr>
-        <w:spacing w:after="120" w:before="60" w:line="300"/>
+        <w:spacing w:after="80" w:before="40" w:line="280"/>
         <w:jc w:val="both"/>
       </w:pPr>
       <w:r>
@@ -297,22 +297,22 @@
     <w:p>
       <w:pPr>
         <w:pStyle w:val="Heading2"/>
-        <w:spacing w:after="120" w:before="240"/>
+        <w:spacing w:after="80" w:before="180"/>
       </w:pPr>
       <w:r>
         <w:rPr>
           <w:b/>
           <w:bCs/>
           <w:color w:val="1F2937"/>
-          <w:sz w:val="26"/>
-          <w:szCs w:val="26"/>
+          <w:sz w:val="24"/>
+          <w:szCs w:val="24"/>
         </w:rPr>
         <w:t xml:space="preserve">1.3  Avgrensingar</w:t>
       </w:r>
     </w:p>
     <w:p>
       <w:pPr>
-        <w:spacing w:after="120" w:before="60" w:line="300"/>
+        <w:spacing w:after="80" w:before="40" w:line="280"/>
         <w:jc w:val="both"/>
       </w:pPr>
       <w:r>
@@ -322,22 +322,22 @@
     <w:p>
       <w:pPr>
         <w:pStyle w:val="Heading1"/>
-        <w:spacing w:after="180" w:before="360"/>
+        <w:spacing w:after="120" w:before="240"/>
       </w:pPr>
       <w:r>
         <w:rPr>
           <w:b/>
           <w:bCs/>
           <w:color w:val="1F2937"/>
-          <w:sz w:val="32"/>
-          <w:szCs w:val="32"/>
+          <w:sz w:val="30"/>
+          <w:szCs w:val="30"/>
         </w:rPr>
         <w:t xml:space="preserve">2  Datasett og datakjelder</w:t>
       </w:r>
     </w:p>
     <w:p>
       <w:pPr>
-        <w:spacing w:after="120" w:before="60" w:line="300"/>
+        <w:spacing w:after="80" w:before="40" w:line="280"/>
         <w:jc w:val="both"/>
       </w:pPr>
       <w:r>
@@ -1089,7 +1089,7 @@
     </w:tbl>
     <w:p>
       <w:pPr>
-        <w:spacing w:after="120" w:before="60" w:line="300"/>
+        <w:spacing w:after="80" w:before="40" w:line="280"/>
         <w:jc w:val="both"/>
       </w:pPr>
       <w:r>
@@ -1105,22 +1105,22 @@
     <w:p>
       <w:pPr>
         <w:pStyle w:val="Heading2"/>
-        <w:spacing w:after="120" w:before="240"/>
+        <w:spacing w:after="80" w:before="180"/>
       </w:pPr>
       <w:r>
         <w:rPr>
           <w:b/>
           <w:bCs/>
           <w:color w:val="1F2937"/>
-          <w:sz w:val="26"/>
-          <w:szCs w:val="26"/>
+          <w:sz w:val="24"/>
+          <w:szCs w:val="24"/>
         </w:rPr>
         <w:t xml:space="preserve">2.1  AED-hjertestartarar</w:t>
       </w:r>
     </w:p>
     <w:p>
       <w:pPr>
-        <w:spacing w:after="120" w:before="60" w:line="300"/>
+        <w:spacing w:after="80" w:before="40" w:line="280"/>
         <w:jc w:val="both"/>
       </w:pPr>
       <w:r>
@@ -1130,22 +1130,22 @@
     <w:p>
       <w:pPr>
         <w:pStyle w:val="Heading2"/>
-        <w:spacing w:after="120" w:before="240"/>
+        <w:spacing w:after="80" w:before="180"/>
       </w:pPr>
       <w:r>
         <w:rPr>
           <w:b/>
           <w:bCs/>
           <w:color w:val="1F2937"/>
-          <w:sz w:val="26"/>
-          <w:szCs w:val="26"/>
+          <w:sz w:val="24"/>
+          <w:szCs w:val="24"/>
         </w:rPr>
         <w:t xml:space="preserve">2.2  Brannstasjonar frå GeoNorge WFS</w:t>
       </w:r>
     </w:p>
     <w:p>
       <w:pPr>
-        <w:spacing w:after="120" w:before="60" w:line="300"/>
+        <w:spacing w:after="80" w:before="40" w:line="280"/>
         <w:jc w:val="both"/>
       </w:pPr>
       <w:r>
@@ -1155,22 +1155,22 @@
     <w:p>
       <w:pPr>
         <w:pStyle w:val="Heading2"/>
-        <w:spacing w:after="120" w:before="240"/>
+        <w:spacing w:after="80" w:before="180"/>
       </w:pPr>
       <w:r>
         <w:rPr>
           <w:b/>
           <w:bCs/>
           <w:color w:val="1F2937"/>
-          <w:sz w:val="26"/>
-          <w:szCs w:val="26"/>
+          <w:sz w:val="24"/>
+          <w:szCs w:val="24"/>
         </w:rPr>
         <w:t xml:space="preserve">2.3  Befolkningsrutenett</w:t>
       </w:r>
     </w:p>
     <w:p>
       <w:pPr>
-        <w:spacing w:after="120" w:before="60" w:line="300"/>
+        <w:spacing w:after="80" w:before="40" w:line="280"/>
         <w:jc w:val="both"/>
       </w:pPr>
       <w:r>
@@ -1180,22 +1180,22 @@
     <w:p>
       <w:pPr>
         <w:pStyle w:val="Heading2"/>
-        <w:spacing w:after="120" w:before="240"/>
+        <w:spacing w:after="80" w:before="180"/>
       </w:pPr>
       <w:r>
         <w:rPr>
           <w:b/>
           <w:bCs/>
           <w:color w:val="1F2937"/>
-          <w:sz w:val="26"/>
-          <w:szCs w:val="26"/>
+          <w:sz w:val="24"/>
+          <w:szCs w:val="24"/>
         </w:rPr>
         <w:t xml:space="preserve">2.4  Dekningsgap (avleidd)</w:t>
       </w:r>
     </w:p>
     <w:p>
       <w:pPr>
-        <w:spacing w:after="120" w:before="60" w:line="300"/>
+        <w:spacing w:after="80" w:before="40" w:line="280"/>
         <w:jc w:val="both"/>
       </w:pPr>
       <w:r>
@@ -1205,15 +1205,15 @@
     <w:p>
       <w:pPr>
         <w:pStyle w:val="Heading1"/>
-        <w:spacing w:after="180" w:before="360"/>
+        <w:spacing w:after="120" w:before="240"/>
       </w:pPr>
       <w:r>
         <w:rPr>
           <w:b/>
           <w:bCs/>
           <w:color w:val="1F2937"/>
-          <w:sz w:val="32"/>
-          <w:szCs w:val="32"/>
+          <w:sz w:val="30"/>
+          <w:szCs w:val="30"/>
         </w:rPr>
         <w:t xml:space="preserve">3  Metode og verktøy</w:t>
       </w:r>
@@ -1221,15 +1221,15 @@
     <w:p>
       <w:pPr>
         <w:pStyle w:val="Heading2"/>
-        <w:spacing w:after="120" w:before="240"/>
+        <w:spacing w:after="80" w:before="180"/>
       </w:pPr>
       <w:r>
         <w:rPr>
           <w:b/>
           <w:bCs/>
           <w:color w:val="1F2937"/>
-          <w:sz w:val="26"/>
-          <w:szCs w:val="26"/>
+          <w:sz w:val="24"/>
+          <w:szCs w:val="24"/>
         </w:rPr>
         <w:t xml:space="preserve">3.1  Teknologistabel</w:t>
       </w:r>
@@ -2037,7 +2037,7 @@
     </w:tbl>
     <w:p>
       <w:pPr>
-        <w:spacing w:after="120" w:before="60" w:line="300"/>
+        <w:spacing w:after="80" w:before="40" w:line="280"/>
         <w:jc w:val="both"/>
       </w:pPr>
       <w:r>
@@ -2053,22 +2053,22 @@
     <w:p>
       <w:pPr>
         <w:pStyle w:val="Heading2"/>
-        <w:spacing w:after="120" w:before="240"/>
+        <w:spacing w:after="80" w:before="180"/>
       </w:pPr>
       <w:r>
         <w:rPr>
           <w:b/>
           <w:bCs/>
           <w:color w:val="1F2937"/>
-          <w:sz w:val="26"/>
-          <w:szCs w:val="26"/>
+          <w:sz w:val="24"/>
+          <w:szCs w:val="24"/>
         </w:rPr>
         <w:t xml:space="preserve">3.2  Koordinatsystem</w:t>
       </w:r>
     </w:p>
     <w:p>
       <w:pPr>
-        <w:spacing w:after="120" w:before="60" w:line="300"/>
+        <w:spacing w:after="80" w:before="40" w:line="280"/>
         <w:jc w:val="both"/>
       </w:pPr>
       <w:r>
@@ -2078,22 +2078,22 @@
     <w:p>
       <w:pPr>
         <w:pStyle w:val="Heading2"/>
-        <w:spacing w:after="120" w:before="240"/>
+        <w:spacing w:after="80" w:before="180"/>
       </w:pPr>
       <w:r>
         <w:rPr>
           <w:b/>
           <w:bCs/>
           <w:color w:val="1F2937"/>
-          <w:sz w:val="26"/>
-          <w:szCs w:val="26"/>
+          <w:sz w:val="24"/>
+          <w:szCs w:val="24"/>
         </w:rPr>
         <w:t xml:space="preserve">3.3  MVC-arkitektur</w:t>
       </w:r>
     </w:p>
     <w:p>
       <w:pPr>
-        <w:spacing w:after="120" w:before="60" w:line="300"/>
+        <w:spacing w:after="80" w:before="40" w:line="280"/>
         <w:jc w:val="both"/>
       </w:pPr>
       <w:r>
@@ -2103,22 +2103,22 @@
     <w:p>
       <w:pPr>
         <w:pStyle w:val="Heading1"/>
-        <w:spacing w:after="180" w:before="360"/>
+        <w:spacing w:after="120" w:before="240"/>
       </w:pPr>
       <w:r>
         <w:rPr>
           <w:b/>
           <w:bCs/>
           <w:color w:val="1F2937"/>
-          <w:sz w:val="32"/>
-          <w:szCs w:val="32"/>
+          <w:sz w:val="30"/>
+          <w:szCs w:val="30"/>
         </w:rPr>
         <w:t xml:space="preserve">4  Romleg analyse</w:t>
       </w:r>
     </w:p>
     <w:p>
       <w:pPr>
-        <w:spacing w:after="120" w:before="60" w:line="300"/>
+        <w:spacing w:after="80" w:before="40" w:line="280"/>
         <w:jc w:val="both"/>
       </w:pPr>
       <w:r>
@@ -2128,28 +2128,28 @@
     <w:p>
       <w:pPr>
         <w:pStyle w:val="Heading2"/>
-        <w:spacing w:after="120" w:before="240"/>
+        <w:spacing w:after="80" w:before="180"/>
       </w:pPr>
       <w:r>
         <w:rPr>
           <w:b/>
           <w:bCs/>
           <w:color w:val="1F2937"/>
-          <w:sz w:val="26"/>
-          <w:szCs w:val="26"/>
+          <w:sz w:val="24"/>
+          <w:szCs w:val="24"/>
         </w:rPr>
         <w:t xml:space="preserve">4.1  Inngangsdata</w:t>
       </w:r>
     </w:p>
     <w:p>
       <w:pPr>
-        <w:spacing w:after="60" w:before="180"/>
+        <w:spacing w:after="40" w:before="80"/>
         <w:jc w:val="center"/>
       </w:pPr>
       <w:r>
         <w:drawing>
           <wp:inline distT="0" distB="0" distL="0" distR="0">
-            <wp:extent cx="5334000" cy="3733800"/>
+            <wp:extent cx="4162425" cy="2914650"/>
             <wp:effectExtent t="0" r="0" b="0" l="0"/>
             <wp:docPr id="1" name="01_oversikt_ressursar.png" descr="Oversikt over alle beredskapsressursar i Kristiansand: AED-ar (grøne), brannstasjonar (oransje) og andre landmarks. Kommunegrensa er teikna i raudt." title="Figur 1"/>
             <wp:cNvGraphicFramePr>
@@ -2174,7 +2174,7 @@
                   <pic:spPr bwMode="auto">
                     <a:xfrm>
                       <a:off x="0" y="0"/>
-                      <a:ext cx="5334000" cy="3733800"/>
+                      <a:ext cx="4162425" cy="2914650"/>
                     </a:xfrm>
                     <a:prstGeom prst="rect">
                       <a:avLst/>
@@ -2189,7 +2189,7 @@
     </w:p>
     <w:p>
       <w:pPr>
-        <w:spacing w:after="240"/>
+        <w:spacing w:after="120"/>
         <w:jc w:val="center"/>
       </w:pPr>
       <w:r>
@@ -2198,8 +2198,8 @@
           <w:bCs/>
           <w:i/>
           <w:iCs/>
-          <w:sz w:val="20"/>
-          <w:szCs w:val="20"/>
+          <w:sz w:val="18"/>
+          <w:szCs w:val="18"/>
         </w:rPr>
         <w:t xml:space="preserve">Figur 1: </w:t>
       </w:r>
@@ -2207,8 +2207,8 @@
         <w:rPr>
           <w:i/>
           <w:iCs/>
-          <w:sz w:val="20"/>
-          <w:szCs w:val="20"/>
+          <w:sz w:val="18"/>
+          <w:szCs w:val="18"/>
         </w:rPr>
         <w:t xml:space="preserve">Oversikt over alle beredskapsressursar i Kristiansand: AED-ar (grøne), brannstasjonar (oransje) og andre landmarks. Kommunegrensa er teikna i raudt.</w:t>
       </w:r>
@@ -2216,28 +2216,28 @@
     <w:p>
       <w:pPr>
         <w:pStyle w:val="Heading2"/>
-        <w:spacing w:after="120" w:before="240"/>
+        <w:spacing w:after="80" w:before="180"/>
       </w:pPr>
       <w:r>
         <w:rPr>
           <w:b/>
           <w:bCs/>
           <w:color w:val="1F2937"/>
-          <w:sz w:val="26"/>
-          <w:szCs w:val="26"/>
+          <w:sz w:val="24"/>
+          <w:szCs w:val="24"/>
         </w:rPr>
         <w:t xml:space="preserve">4.2  Befolkningsmodell</w:t>
       </w:r>
     </w:p>
     <w:p>
       <w:pPr>
-        <w:spacing w:after="60" w:before="180"/>
+        <w:spacing w:after="40" w:before="80"/>
         <w:jc w:val="center"/>
       </w:pPr>
       <w:r>
         <w:drawing>
           <wp:inline distT="0" distB="0" distL="0" distR="0">
-            <wp:extent cx="5334000" cy="3733800"/>
+            <wp:extent cx="4162425" cy="2914650"/>
             <wp:effectExtent t="0" r="0" b="0" l="0"/>
             <wp:docPr id="1" name="02_befolkning_250m.png" descr="Befolkningsrutenett (250 m) med distance-decay frå ni bydelssentrum. Total: 115 000." title="Figur 2"/>
             <wp:cNvGraphicFramePr>
@@ -2262,7 +2262,7 @@
                   <pic:spPr bwMode="auto">
                     <a:xfrm>
                       <a:off x="0" y="0"/>
-                      <a:ext cx="5334000" cy="3733800"/>
+                      <a:ext cx="4162425" cy="2914650"/>
                     </a:xfrm>
                     <a:prstGeom prst="rect">
                       <a:avLst/>
@@ -2277,7 +2277,7 @@
     </w:p>
     <w:p>
       <w:pPr>
-        <w:spacing w:after="240"/>
+        <w:spacing w:after="120"/>
         <w:jc w:val="center"/>
       </w:pPr>
       <w:r>
@@ -2286,8 +2286,8 @@
           <w:bCs/>
           <w:i/>
           <w:iCs/>
-          <w:sz w:val="20"/>
-          <w:szCs w:val="20"/>
+          <w:sz w:val="18"/>
+          <w:szCs w:val="18"/>
         </w:rPr>
         <w:t xml:space="preserve">Figur 2: </w:t>
       </w:r>
@@ -2295,8 +2295,8 @@
         <w:rPr>
           <w:i/>
           <w:iCs/>
-          <w:sz w:val="20"/>
-          <w:szCs w:val="20"/>
+          <w:sz w:val="18"/>
+          <w:szCs w:val="18"/>
         </w:rPr>
         <w:t xml:space="preserve">Befolkningsrutenett (250 m) med distance-decay frå ni bydelssentrum. Total: 115 000.</w:t>
       </w:r>
@@ -2304,22 +2304,22 @@
     <w:p>
       <w:pPr>
         <w:pStyle w:val="Heading2"/>
-        <w:spacing w:after="120" w:before="240"/>
+        <w:spacing w:after="80" w:before="180"/>
       </w:pPr>
       <w:r>
         <w:rPr>
           <w:b/>
           <w:bCs/>
           <w:color w:val="1F2937"/>
-          <w:sz w:val="26"/>
-          <w:szCs w:val="26"/>
+          <w:sz w:val="24"/>
+          <w:szCs w:val="24"/>
         </w:rPr>
         <w:t xml:space="preserve">4.3  Buffer — service areas</w:t>
       </w:r>
     </w:p>
     <w:p>
       <w:pPr>
-        <w:spacing w:after="120" w:before="60" w:line="300"/>
+        <w:spacing w:after="80" w:before="40" w:line="280"/>
         <w:jc w:val="both"/>
       </w:pPr>
       <w:r>
@@ -2328,13 +2328,13 @@
     </w:p>
     <w:p>
       <w:pPr>
-        <w:spacing w:after="60" w:before="180"/>
+        <w:spacing w:after="40" w:before="80"/>
         <w:jc w:val="center"/>
       </w:pPr>
       <w:r>
         <w:drawing>
           <wp:inline distT="0" distB="0" distL="0" distR="0">
-            <wp:extent cx="5334000" cy="3733800"/>
+            <wp:extent cx="4162425" cy="2914650"/>
             <wp:effectExtent t="0" r="0" b="0" l="0"/>
             <wp:docPr id="1" name="03_service_areas.png" descr="Service areas (400 m) rundt eksisterande AED-ar." title="Figur 3"/>
             <wp:cNvGraphicFramePr>
@@ -2359,7 +2359,7 @@
                   <pic:spPr bwMode="auto">
                     <a:xfrm>
                       <a:off x="0" y="0"/>
-                      <a:ext cx="5334000" cy="3733800"/>
+                      <a:ext cx="4162425" cy="2914650"/>
                     </a:xfrm>
                     <a:prstGeom prst="rect">
                       <a:avLst/>
@@ -2374,7 +2374,7 @@
     </w:p>
     <w:p>
       <w:pPr>
-        <w:spacing w:after="240"/>
+        <w:spacing w:after="120"/>
         <w:jc w:val="center"/>
       </w:pPr>
       <w:r>
@@ -2383,8 +2383,8 @@
           <w:bCs/>
           <w:i/>
           <w:iCs/>
-          <w:sz w:val="20"/>
-          <w:szCs w:val="20"/>
+          <w:sz w:val="18"/>
+          <w:szCs w:val="18"/>
         </w:rPr>
         <w:t xml:space="preserve">Figur 3: </w:t>
       </w:r>
@@ -2392,8 +2392,8 @@
         <w:rPr>
           <w:i/>
           <w:iCs/>
-          <w:sz w:val="20"/>
-          <w:szCs w:val="20"/>
+          <w:sz w:val="18"/>
+          <w:szCs w:val="18"/>
         </w:rPr>
         <w:t xml:space="preserve">Service areas (400 m) rundt eksisterande AED-ar.</w:t>
       </w:r>
@@ -2401,22 +2401,22 @@
     <w:p>
       <w:pPr>
         <w:pStyle w:val="Heading2"/>
-        <w:spacing w:after="120" w:before="240"/>
+        <w:spacing w:after="80" w:before="180"/>
       </w:pPr>
       <w:r>
         <w:rPr>
           <w:b/>
           <w:bCs/>
           <w:color w:val="1F2937"/>
-          <w:sz w:val="26"/>
-          <w:szCs w:val="26"/>
+          <w:sz w:val="24"/>
+          <w:szCs w:val="24"/>
         </w:rPr>
         <w:t xml:space="preserve">4.4  Overlay — dekningsgap</w:t>
       </w:r>
     </w:p>
     <w:p>
       <w:pPr>
-        <w:spacing w:after="120" w:before="60" w:line="300"/>
+        <w:spacing w:after="80" w:before="40" w:line="280"/>
         <w:jc w:val="both"/>
       </w:pPr>
       <w:r>
@@ -2425,13 +2425,13 @@
     </w:p>
     <w:p>
       <w:pPr>
-        <w:spacing w:after="60" w:before="180"/>
+        <w:spacing w:after="40" w:before="80"/>
         <w:jc w:val="center"/>
       </w:pPr>
       <w:r>
         <w:drawing>
           <wp:inline distT="0" distB="0" distL="0" distR="0">
-            <wp:extent cx="5334000" cy="3733800"/>
+            <wp:extent cx="4162425" cy="2914650"/>
             <wp:effectExtent t="0" r="0" b="0" l="0"/>
             <wp:docPr id="1" name="04_coverage_gaps.png" descr="Dekningsgap (raudt) — område innanfor kommunen utan AED innan 400 m. Eksisterande AED-ar i kvite prikkar, AED-dekninga i grønt." title="Figur 4"/>
             <wp:cNvGraphicFramePr>
@@ -2456,7 +2456,7 @@
                   <pic:spPr bwMode="auto">
                     <a:xfrm>
                       <a:off x="0" y="0"/>
-                      <a:ext cx="5334000" cy="3733800"/>
+                      <a:ext cx="4162425" cy="2914650"/>
                     </a:xfrm>
                     <a:prstGeom prst="rect">
                       <a:avLst/>
@@ -2471,7 +2471,7 @@
     </w:p>
     <w:p>
       <w:pPr>
-        <w:spacing w:after="240"/>
+        <w:spacing w:after="120"/>
         <w:jc w:val="center"/>
       </w:pPr>
       <w:r>
@@ -2480,8 +2480,8 @@
           <w:bCs/>
           <w:i/>
           <w:iCs/>
-          <w:sz w:val="20"/>
-          <w:szCs w:val="20"/>
+          <w:sz w:val="18"/>
+          <w:szCs w:val="18"/>
         </w:rPr>
         <w:t xml:space="preserve">Figur 4: </w:t>
       </w:r>
@@ -2489,8 +2489,8 @@
         <w:rPr>
           <w:i/>
           <w:iCs/>
-          <w:sz w:val="20"/>
-          <w:szCs w:val="20"/>
+          <w:sz w:val="18"/>
+          <w:szCs w:val="18"/>
         </w:rPr>
         <w:t xml:space="preserve">Dekningsgap (raudt) — område innanfor kommunen utan AED innan 400 m. Eksisterande AED-ar i kvite prikkar, AED-dekninga i grønt.</w:t>
       </w:r>
@@ -2498,22 +2498,22 @@
     <w:p>
       <w:pPr>
         <w:pStyle w:val="Heading2"/>
-        <w:spacing w:after="120" w:before="240"/>
+        <w:spacing w:after="80" w:before="180"/>
       </w:pPr>
       <w:r>
         <w:rPr>
           <w:b/>
           <w:bCs/>
           <w:color w:val="1F2937"/>
-          <w:sz w:val="26"/>
-          <w:szCs w:val="26"/>
+          <w:sz w:val="24"/>
+          <w:szCs w:val="24"/>
         </w:rPr>
         <w:t xml:space="preserve">4.5  Romleg aggregering — risikoscore</w:t>
       </w:r>
     </w:p>
     <w:p>
       <w:pPr>
-        <w:spacing w:after="120" w:before="60" w:line="300"/>
+        <w:spacing w:after="80" w:before="40" w:line="280"/>
         <w:jc w:val="both"/>
       </w:pPr>
       <w:r>
@@ -2537,7 +2537,7 @@
     </w:p>
     <w:p>
       <w:pPr>
-        <w:spacing w:after="120" w:before="60" w:line="300"/>
+        <w:spacing w:after="80" w:before="40" w:line="280"/>
         <w:jc w:val="both"/>
       </w:pPr>
       <w:r>
@@ -2546,13 +2546,13 @@
     </w:p>
     <w:p>
       <w:pPr>
-        <w:spacing w:after="60" w:before="180"/>
+        <w:spacing w:after="40" w:before="80"/>
         <w:jc w:val="center"/>
       </w:pPr>
       <w:r>
         <w:drawing>
           <wp:inline distT="0" distB="0" distL="0" distR="0">
-            <wp:extent cx="5334000" cy="3733800"/>
+            <wp:extent cx="4162425" cy="2914650"/>
             <wp:effectExtent t="0" r="0" b="0" l="0"/>
             <wp:docPr id="1" name="05_risk_grid.png" descr="Koroplett over risikoscore per 250m-celle. Kritiske område (mørk raud) har både høg befolkning og minimal AED-dekning." title="Figur 5"/>
             <wp:cNvGraphicFramePr>
@@ -2577,7 +2577,7 @@
                   <pic:spPr bwMode="auto">
                     <a:xfrm>
                       <a:off x="0" y="0"/>
-                      <a:ext cx="5334000" cy="3733800"/>
+                      <a:ext cx="4162425" cy="2914650"/>
                     </a:xfrm>
                     <a:prstGeom prst="rect">
                       <a:avLst/>
@@ -2592,7 +2592,7 @@
     </w:p>
     <w:p>
       <w:pPr>
-        <w:spacing w:after="240"/>
+        <w:spacing w:after="120"/>
         <w:jc w:val="center"/>
       </w:pPr>
       <w:r>
@@ -2601,8 +2601,8 @@
           <w:bCs/>
           <w:i/>
           <w:iCs/>
-          <w:sz w:val="20"/>
-          <w:szCs w:val="20"/>
+          <w:sz w:val="18"/>
+          <w:szCs w:val="18"/>
         </w:rPr>
         <w:t xml:space="preserve">Figur 5: </w:t>
       </w:r>
@@ -2610,8 +2610,8 @@
         <w:rPr>
           <w:i/>
           <w:iCs/>
-          <w:sz w:val="20"/>
-          <w:szCs w:val="20"/>
+          <w:sz w:val="18"/>
+          <w:szCs w:val="18"/>
         </w:rPr>
         <w:t xml:space="preserve">Koroplett over risikoscore per 250m-celle. Kritiske område (mørk raud) har både høg befolkning og minimal AED-dekning.</w:t>
       </w:r>
@@ -2619,22 +2619,22 @@
     <w:p>
       <w:pPr>
         <w:pStyle w:val="Heading2"/>
-        <w:spacing w:after="120" w:before="240"/>
+        <w:spacing w:after="80" w:before="180"/>
       </w:pPr>
       <w:r>
         <w:rPr>
           <w:b/>
           <w:bCs/>
           <w:color w:val="1F2937"/>
-          <w:sz w:val="26"/>
-          <w:szCs w:val="26"/>
+          <w:sz w:val="24"/>
+          <w:szCs w:val="24"/>
         </w:rPr>
         <w:t xml:space="preserve">4.6  Algoritme — grådig dekningsoptimering</w:t>
       </w:r>
     </w:p>
     <w:p>
       <w:pPr>
-        <w:spacing w:after="120" w:before="60" w:line="300"/>
+        <w:spacing w:after="80" w:before="40" w:line="280"/>
         <w:jc w:val="both"/>
       </w:pPr>
       <w:r>
@@ -2695,7 +2695,7 @@
     </w:p>
     <w:p>
       <w:pPr>
-        <w:spacing w:after="120" w:before="60" w:line="300"/>
+        <w:spacing w:after="80" w:before="40" w:line="280"/>
         <w:jc w:val="both"/>
       </w:pPr>
       <w:r>
@@ -2704,13 +2704,13 @@
     </w:p>
     <w:p>
       <w:pPr>
-        <w:spacing w:after="60" w:before="180"/>
+        <w:spacing w:after="40" w:before="80"/>
         <w:jc w:val="center"/>
       </w:pPr>
       <w:r>
         <w:drawing>
           <wp:inline distT="0" distB="0" distL="0" distR="0">
-            <wp:extent cx="5334000" cy="3733800"/>
+            <wp:extent cx="4162425" cy="2914650"/>
             <wp:effectExtent t="0" r="0" b="0" l="0"/>
             <wp:docPr id="1" name="06_recommendations.png" descr="Topp-10 anbefalte nye AED-plasseringar (lilla nummererte markørar) på toppen av risk-grid. Kvite prikkar markerer eksisterande AED-ar." title="Figur 6"/>
             <wp:cNvGraphicFramePr>
@@ -2735,7 +2735,7 @@
                   <pic:spPr bwMode="auto">
                     <a:xfrm>
                       <a:off x="0" y="0"/>
-                      <a:ext cx="5334000" cy="3733800"/>
+                      <a:ext cx="4162425" cy="2914650"/>
                     </a:xfrm>
                     <a:prstGeom prst="rect">
                       <a:avLst/>
@@ -2750,7 +2750,7 @@
     </w:p>
     <w:p>
       <w:pPr>
-        <w:spacing w:after="240"/>
+        <w:spacing w:after="120"/>
         <w:jc w:val="center"/>
       </w:pPr>
       <w:r>
@@ -2759,8 +2759,8 @@
           <w:bCs/>
           <w:i/>
           <w:iCs/>
-          <w:sz w:val="20"/>
-          <w:szCs w:val="20"/>
+          <w:sz w:val="18"/>
+          <w:szCs w:val="18"/>
         </w:rPr>
         <w:t xml:space="preserve">Figur 6: </w:t>
       </w:r>
@@ -2768,21 +2768,21 @@
         <w:rPr>
           <w:i/>
           <w:iCs/>
-          <w:sz w:val="20"/>
-          <w:szCs w:val="20"/>
+          <w:sz w:val="18"/>
+          <w:szCs w:val="18"/>
         </w:rPr>
         <w:t xml:space="preserve">Topp-10 anbefalte nye AED-plasseringar (lilla nummererte markørar) på toppen av risk-grid. Kvite prikkar markerer eksisterande AED-ar.</w:t>
       </w:r>
     </w:p>
     <w:p>
       <w:pPr>
-        <w:spacing w:after="60" w:before="180"/>
+        <w:spacing w:after="40" w:before="80"/>
         <w:jc w:val="center"/>
       </w:pPr>
       <w:r>
         <w:drawing>
           <wp:inline distT="0" distB="0" distL="0" distR="0">
-            <wp:extent cx="5334000" cy="3200400"/>
+            <wp:extent cx="4162425" cy="2495550"/>
             <wp:effectExtent t="0" r="0" b="0" l="0"/>
             <wp:docPr id="1" name="07_before_after.png" descr="Dekningssamanlikning før (venstre) og etter (høgre) ti nye anbefalte AED-plasseringar." title="Figur 7"/>
             <wp:cNvGraphicFramePr>
@@ -2807,7 +2807,7 @@
                   <pic:spPr bwMode="auto">
                     <a:xfrm>
                       <a:off x="0" y="0"/>
-                      <a:ext cx="5334000" cy="3200400"/>
+                      <a:ext cx="4162425" cy="2495550"/>
                     </a:xfrm>
                     <a:prstGeom prst="rect">
                       <a:avLst/>
@@ -2822,7 +2822,7 @@
     </w:p>
     <w:p>
       <w:pPr>
-        <w:spacing w:after="240"/>
+        <w:spacing w:after="120"/>
         <w:jc w:val="center"/>
       </w:pPr>
       <w:r>
@@ -2831,8 +2831,8 @@
           <w:bCs/>
           <w:i/>
           <w:iCs/>
-          <w:sz w:val="20"/>
-          <w:szCs w:val="20"/>
+          <w:sz w:val="18"/>
+          <w:szCs w:val="18"/>
         </w:rPr>
         <w:t xml:space="preserve">Figur 7: </w:t>
       </w:r>
@@ -2840,8 +2840,8 @@
         <w:rPr>
           <w:i/>
           <w:iCs/>
-          <w:sz w:val="20"/>
-          <w:szCs w:val="20"/>
+          <w:sz w:val="18"/>
+          <w:szCs w:val="18"/>
         </w:rPr>
         <w:t xml:space="preserve">Dekningssamanlikning før (venstre) og etter (høgre) ti nye anbefalte AED-plasseringar.</w:t>
       </w:r>
@@ -2849,22 +2849,22 @@
     <w:p>
       <w:pPr>
         <w:pStyle w:val="Heading1"/>
-        <w:spacing w:after="180" w:before="360"/>
+        <w:spacing w:after="120" w:before="240"/>
       </w:pPr>
       <w:r>
         <w:rPr>
           <w:b/>
           <w:bCs/>
           <w:color w:val="1F2937"/>
-          <w:sz w:val="32"/>
-          <w:szCs w:val="32"/>
+          <w:sz w:val="30"/>
+          <w:szCs w:val="30"/>
         </w:rPr>
         <w:t xml:space="preserve">5  Resultat</w:t>
       </w:r>
     </w:p>
     <w:p>
       <w:pPr>
-        <w:spacing w:after="120" w:before="60" w:line="300"/>
+        <w:spacing w:after="80" w:before="40" w:line="280"/>
         <w:jc w:val="both"/>
       </w:pPr>
       <w:r>
@@ -3535,7 +3535,7 @@
     </w:tbl>
     <w:p>
       <w:pPr>
-        <w:spacing w:after="120" w:before="60" w:line="300"/>
+        <w:spacing w:after="80" w:before="40" w:line="280"/>
         <w:jc w:val="both"/>
       </w:pPr>
       <w:r>
@@ -3551,22 +3551,22 @@
     <w:p>
       <w:pPr>
         <w:pStyle w:val="Heading2"/>
-        <w:spacing w:after="120" w:before="240"/>
+        <w:spacing w:after="80" w:before="180"/>
       </w:pPr>
       <w:r>
         <w:rPr>
           <w:b/>
           <w:bCs/>
           <w:color w:val="1F2937"/>
-          <w:sz w:val="26"/>
-          <w:szCs w:val="26"/>
+          <w:sz w:val="24"/>
+          <w:szCs w:val="24"/>
         </w:rPr>
         <w:t xml:space="preserve">5.1  Romleg mønster</w:t>
       </w:r>
     </w:p>
     <w:p>
       <w:pPr>
-        <w:spacing w:after="120" w:before="60" w:line="300"/>
+        <w:spacing w:after="80" w:before="40" w:line="280"/>
         <w:jc w:val="both"/>
       </w:pPr>
       <w:r>
@@ -3576,22 +3576,22 @@
     <w:p>
       <w:pPr>
         <w:pStyle w:val="Heading2"/>
-        <w:spacing w:after="120" w:before="240"/>
+        <w:spacing w:after="80" w:before="180"/>
       </w:pPr>
       <w:r>
         <w:rPr>
           <w:b/>
           <w:bCs/>
           <w:color w:val="1F2937"/>
-          <w:sz w:val="26"/>
-          <w:szCs w:val="26"/>
+          <w:sz w:val="24"/>
+          <w:szCs w:val="24"/>
         </w:rPr>
         <w:t xml:space="preserve">5.2  Webløysing</w:t>
       </w:r>
     </w:p>
     <w:p>
       <w:pPr>
-        <w:spacing w:after="120" w:before="60" w:line="300"/>
+        <w:spacing w:after="80" w:before="40" w:line="280"/>
         <w:jc w:val="both"/>
       </w:pPr>
       <w:r>
@@ -3601,15 +3601,15 @@
     <w:p>
       <w:pPr>
         <w:pStyle w:val="Heading1"/>
-        <w:spacing w:after="180" w:before="360"/>
+        <w:spacing w:after="120" w:before="240"/>
       </w:pPr>
       <w:r>
         <w:rPr>
           <w:b/>
           <w:bCs/>
           <w:color w:val="1F2937"/>
-          <w:sz w:val="32"/>
-          <w:szCs w:val="32"/>
+          <w:sz w:val="30"/>
+          <w:szCs w:val="30"/>
         </w:rPr>
         <w:t xml:space="preserve">6  Diskusjon</w:t>
       </w:r>
@@ -3617,15 +3617,15 @@
     <w:p>
       <w:pPr>
         <w:pStyle w:val="Heading2"/>
-        <w:spacing w:after="120" w:before="240"/>
+        <w:spacing w:after="80" w:before="180"/>
       </w:pPr>
       <w:r>
         <w:rPr>
           <w:b/>
           <w:bCs/>
           <w:color w:val="1F2937"/>
-          <w:sz w:val="26"/>
-          <w:szCs w:val="26"/>
+          <w:sz w:val="24"/>
+          <w:szCs w:val="24"/>
         </w:rPr>
         <w:t xml:space="preserve">6.1  Styrker</w:t>
       </w:r>
@@ -3698,15 +3698,15 @@
     <w:p>
       <w:pPr>
         <w:pStyle w:val="Heading2"/>
-        <w:spacing w:after="120" w:before="240"/>
+        <w:spacing w:after="80" w:before="180"/>
       </w:pPr>
       <w:r>
         <w:rPr>
           <w:b/>
           <w:bCs/>
           <w:color w:val="1F2937"/>
-          <w:sz w:val="26"/>
-          <w:szCs w:val="26"/>
+          <w:sz w:val="24"/>
+          <w:szCs w:val="24"/>
         </w:rPr>
         <w:t xml:space="preserve">6.2  Avgrensingar</w:t>
       </w:r>
@@ -3779,15 +3779,15 @@
     <w:p>
       <w:pPr>
         <w:pStyle w:val="Heading2"/>
-        <w:spacing w:after="120" w:before="240"/>
+        <w:spacing w:after="80" w:before="180"/>
       </w:pPr>
       <w:r>
         <w:rPr>
           <w:b/>
           <w:bCs/>
           <w:color w:val="1F2937"/>
-          <w:sz w:val="26"/>
-          <w:szCs w:val="26"/>
+          <w:sz w:val="24"/>
+          <w:szCs w:val="24"/>
         </w:rPr>
         <w:t xml:space="preserve">6.3  Vidare arbeid</w:t>
       </w:r>
@@ -3873,22 +3873,22 @@
     <w:p>
       <w:pPr>
         <w:pStyle w:val="Heading1"/>
-        <w:spacing w:after="180" w:before="360"/>
+        <w:spacing w:after="120" w:before="240"/>
       </w:pPr>
       <w:r>
         <w:rPr>
           <w:b/>
           <w:bCs/>
           <w:color w:val="1F2937"/>
-          <w:sz w:val="32"/>
-          <w:szCs w:val="32"/>
+          <w:sz w:val="30"/>
+          <w:szCs w:val="30"/>
         </w:rPr>
         <w:t xml:space="preserve">7  Konklusjon</w:t>
       </w:r>
     </w:p>
     <w:p>
       <w:pPr>
-        <w:spacing w:after="120" w:before="60" w:line="300"/>
+        <w:spacing w:after="80" w:before="40" w:line="280"/>
         <w:jc w:val="both"/>
       </w:pPr>
       <w:r>
@@ -3897,7 +3897,7 @@
     </w:p>
     <w:p>
       <w:pPr>
-        <w:spacing w:after="120" w:before="60" w:line="300"/>
+        <w:spacing w:after="80" w:before="40" w:line="280"/>
         <w:jc w:val="both"/>
       </w:pPr>
       <w:r>
@@ -3905,30 +3905,35 @@
       </w:r>
     </w:p>
     <w:p>
+      <w:r>
+        <w:br w:type="page"/>
+      </w:r>
+    </w:p>
+    <w:p>
       <w:pPr>
         <w:pStyle w:val="Heading1"/>
-        <w:spacing w:after="180" w:before="360"/>
+        <w:spacing w:after="120" w:before="240"/>
       </w:pPr>
       <w:r>
         <w:rPr>
           <w:b/>
           <w:bCs/>
           <w:color w:val="1F2937"/>
-          <w:sz w:val="32"/>
-          <w:szCs w:val="32"/>
-        </w:rPr>
-        <w:t xml:space="preserve">Kjelder</w:t>
-      </w:r>
-    </w:p>
-    <w:p>
-      <w:pPr>
-        <w:spacing w:after="120" w:before="60" w:line="300"/>
+          <w:sz w:val="30"/>
+          <w:szCs w:val="30"/>
+        </w:rPr>
+        <w:t xml:space="preserve">Kjelder (vedlegg)</w:t>
+      </w:r>
+    </w:p>
+    <w:p>
+      <w:pPr>
+        <w:spacing w:after="80" w:before="40" w:line="280"/>
         <w:jc w:val="both"/>
       </w:pPr>
       <w:r>
         <w:t xml:space="preserve">GeoNorge (2025). </w:t>
       </w:r>
-      <w:hyperlink w:history="1" r:id="rIdbm5pu1c-4rb3k3burthc3">
+      <w:hyperlink w:history="1" r:id="rIdg-vjr7eikzrfrnti_tfna">
         <w:r>
           <w:rPr>
             <w:rStyle w:val="Hyperlink"/>
@@ -3939,13 +3944,13 @@
     </w:p>
     <w:p>
       <w:pPr>
-        <w:spacing w:after="120" w:before="60" w:line="300"/>
+        <w:spacing w:after="80" w:before="40" w:line="280"/>
         <w:jc w:val="both"/>
       </w:pPr>
       <w:r>
         <w:t xml:space="preserve">Helsedirektoratet (2024). </w:t>
       </w:r>
-      <w:hyperlink w:history="1" r:id="rIdxsf8fhljqpkn4hfmga0ye">
+      <w:hyperlink w:history="1" r:id="rIdkm2l9-swuaewklbh2vo-l">
         <w:r>
           <w:rPr>
             <w:rStyle w:val="Hyperlink"/>
@@ -3956,13 +3961,13 @@
     </w:p>
     <w:p>
       <w:pPr>
-        <w:spacing w:after="120" w:before="60" w:line="300"/>
+        <w:spacing w:after="80" w:before="40" w:line="280"/>
         <w:jc w:val="both"/>
       </w:pPr>
       <w:r>
         <w:t xml:space="preserve">SSB (2024). </w:t>
       </w:r>
-      <w:hyperlink w:history="1" r:id="rId8oqnataybd6_huuxtplsq">
+      <w:hyperlink w:history="1" r:id="rIdbhjujkpe738i2r_hto1qd">
         <w:r>
           <w:rPr>
             <w:rStyle w:val="Hyperlink"/>
@@ -3973,7 +3978,7 @@
     </w:p>
     <w:p>
       <w:pPr>
-        <w:spacing w:after="120" w:before="60" w:line="300"/>
+        <w:spacing w:after="80" w:before="40" w:line="280"/>
         <w:jc w:val="both"/>
       </w:pPr>
       <w:r>
@@ -3982,7 +3987,7 @@
     </w:p>
     <w:p>
       <w:pPr>
-        <w:spacing w:after="120" w:before="60" w:line="300"/>
+        <w:spacing w:after="80" w:before="40" w:line="280"/>
         <w:jc w:val="both"/>
       </w:pPr>
       <w:r>
@@ -3991,7 +3996,7 @@
     </w:p>
     <w:p>
       <w:pPr>
-        <w:spacing w:after="120" w:before="60" w:line="300"/>
+        <w:spacing w:after="80" w:before="40" w:line="280"/>
         <w:jc w:val="both"/>
       </w:pPr>
       <w:r>

</xml_diff>